<commit_message>
updated the diagnostic engine files to the latest version (v10)
</commit_message>
<xml_diff>
--- a/audit/v9_lookup_bank_audit_record.docx
+++ b/audit/v9_lookup_bank_audit_record.docx
@@ -121,7 +121,7 @@
         <w:t xml:space="preserve">ID the tenant does not use), the open question was whether the same wrong-ID error existed on any other row.</w:t>
       </w:r>
     </w:p>
-    <w:bookmarkStart w:id="20" w:name="X1d2e729efb85b7f395d6107ad0ddf2c8a7bc928"/>
+    <w:bookmarkStart w:id="20" w:name="X34cc66eb0d5fad9e57d988e36c57f0703d321c0"/>
     <w:p>
       <w:pPr>
         <w:pStyle w:val="Heading2"/>
@@ -151,7 +151,7 @@
         <w:rPr>
           <w:rStyle w:val="VerbatimChar"/>
         </w:rPr>
-        <w:t xml:space="preserve">diagnostic_engine_v9/inputs/tenant_question_lookup_v2.csv</w:t>
+        <w:t xml:space="preserve">diagnostic_engine/inputs/tenant_question_lookup_v2.csv</w:t>
       </w:r>
       <w:r>
         <w:t xml:space="preserve">) still carried the pre-correction Private</w:t>
@@ -295,7 +295,7 @@
     <w:tbl>
       <w:tblPr>
         <w:tblStyle w:val="Table"/>
-        <w:tblW w:type="pct" w:w="5000"/>
+        <w:tblW w:type="auto" w:w="0"/>
         <w:tblLook w:firstRow="1" w:lastRow="0" w:firstColumn="0" w:lastColumn="0" w:noHBand="0" w:noVBand="0" w:val="0020"/>
         <w:jc w:val="start"/>
       </w:tblPr>
@@ -513,25 +513,7 @@
               <w:jc w:val="left"/>
             </w:pPr>
             <w:r>
-              <w:t xml:space="preserve">Delhi-only; the Karnataka/Private/Telangana copies remain correctly absent (deleted questions, per</w:t>
-            </w:r>
-            <w:r>
-              <w:t xml:space="preserve"> </w:t>
-            </w:r>
-            <w:r>
-              <w:t xml:space="preserve">“</w:t>
-            </w:r>
-            <w:r>
-              <w:t xml:space="preserve">One false positive, cleared</w:t>
-            </w:r>
-            <w:r>
-              <w:t xml:space="preserve">”</w:t>
-            </w:r>
-            <w:r>
-              <w:t xml:space="preserve"> </w:t>
-            </w:r>
-            <w:r>
-              <w:t xml:space="preserve">below)</w:t>
+              <w:t xml:space="preserve">Delhi-only; the Karnataka/Private/Telangana copies remain correctly absent (deleted questions, per "One false positive, cleared" below)</w:t>
             </w:r>
           </w:p>
         </w:tc>
@@ -685,7 +667,7 @@
     <w:tbl>
       <w:tblPr>
         <w:tblStyle w:val="Table"/>
-        <w:tblW w:type="pct" w:w="5000"/>
+        <w:tblW w:type="auto" w:w="0"/>
         <w:tblLook w:firstRow="1" w:lastRow="0" w:firstColumn="0" w:lastColumn="0" w:noHBand="0" w:noVBand="0" w:val="0020"/>
         <w:jc w:val="start"/>
       </w:tblPr>
@@ -795,7 +777,10 @@
               <w:jc w:val="left"/>
             </w:pPr>
             <w:r>
-              <w:t xml:space="preserve">A physical question’s stored identifier (e.g. </w:t>
+              <w:t xml:space="preserve">A physical question's stored identifier (e.g.</w:t>
+            </w:r>
+            <w:r>
+              <w:t xml:space="preserve"> </w:t>
             </w:r>
             <w:r>
               <w:rPr>
@@ -992,7 +977,7 @@
     <w:tbl>
       <w:tblPr>
         <w:tblStyle w:val="Table"/>
-        <w:tblW w:type="pct" w:w="5000"/>
+        <w:tblW w:type="auto" w:w="0"/>
         <w:tblLook w:firstRow="1" w:lastRow="0" w:firstColumn="0" w:lastColumn="0" w:noHBand="0" w:noVBand="0" w:val="0020"/>
         <w:jc w:val="start"/>
       </w:tblPr>
@@ -1186,7 +1171,7 @@
     <w:tbl>
       <w:tblPr>
         <w:tblStyle w:val="Table"/>
-        <w:tblW w:type="pct" w:w="5000"/>
+        <w:tblW w:type="auto" w:w="0"/>
         <w:tblLook w:firstRow="1" w:lastRow="0" w:firstColumn="0" w:lastColumn="0" w:noHBand="0" w:noVBand="0" w:val="0020"/>
         <w:jc w:val="start"/>
       </w:tblPr>
@@ -1378,22 +1363,7 @@
         <w:t xml:space="preserve"> </w:t>
       </w:r>
       <w:r>
-        <w:t xml:space="preserve">remap landed in the bundle but the loose copy was never re-saved. Because the loose file is named</w:t>
-      </w:r>
-      <w:r>
-        <w:t xml:space="preserve"> </w:t>
-      </w:r>
-      <w:r>
-        <w:t xml:space="preserve">“</w:t>
-      </w:r>
-      <w:r>
-        <w:t xml:space="preserve">FINAL</w:t>
-      </w:r>
-      <w:r>
-        <w:t xml:space="preserve">”</w:t>
-      </w:r>
-      <w:r>
-        <w:t xml:space="preserve">, it was a trap: anyone using it instead of the bundle would have re-introduced the exact Private bug. Resolution: the loose file was overwritten with the bundle’s version. Both now agree (2,536 rows, Private splits at</w:t>
+        <w:t xml:space="preserve">remap landed in the bundle but the loose copy was never re-saved. Because the loose file is named "FINAL", it was a trap: anyone using it instead of the bundle would have re-introduced the exact Private bug. Resolution: the loose file was overwritten with the bundle's version. Both now agree (2,536 rows, Private splits at</w:t>
       </w:r>
       <w:r>
         <w:t xml:space="preserve"> </w:t>
@@ -1437,7 +1407,7 @@
     <w:tbl>
       <w:tblPr>
         <w:tblStyle w:val="Table"/>
-        <w:tblW w:type="pct" w:w="5000"/>
+        <w:tblW w:type="auto" w:w="0"/>
         <w:tblLook w:firstRow="1" w:lastRow="0" w:firstColumn="0" w:lastColumn="0" w:noHBand="0" w:noVBand="0" w:val="0020"/>
         <w:jc w:val="start"/>
       </w:tblPr>
@@ -2324,7 +2294,7 @@
         <w:pStyle w:val="FirstParagraph"/>
       </w:pPr>
       <w:r>
-        <w:t xml:space="preserve">Why this is safe: every one of the lookup’s 2,536 (tenant, x_id) pairs is present in the workbook-derived bank, so the workbook covers 100 percent of the IDs the lookup actually touches. The workbook’s per-tenant suffix counts match the stated distribution exactly for Delhi (411</w:t>
+        <w:t xml:space="preserve">Why this is safe: every one of the lookup's 2,536 (tenant, x_id) pairs is present in the workbook-derived bank, so the workbook covers 100 percent of the IDs the lookup actually touches. The workbook's per-tenant suffix counts match the stated distribution exactly for Delhi (411</w:t>
       </w:r>
       <w:r>
         <w:t xml:space="preserve"> </w:t>
@@ -2381,19 +2351,7 @@
         <w:pStyle w:val="FirstParagraph"/>
       </w:pPr>
       <w:r>
-        <w:t xml:space="preserve">The reverse check (C) initially flagged 5/1 (</w:t>
-      </w:r>
-      <w:r>
-        <w:t xml:space="preserve">“</w:t>
-      </w:r>
-      <w:r>
-        <w:t xml:space="preserve">Relationship between Multiplication and Division</w:t>
-      </w:r>
-      <w:r>
-        <w:t xml:space="preserve">”</w:t>
-      </w:r>
-      <w:r>
-        <w:t xml:space="preserve">) as served by the bank to Karnataka and Private but by the lookup only to Delhi. This was a stale-workbook artifact. The pre-correction workbook held Karnataka, Private, and Telangana copies of 5/1, including</w:t>
+        <w:t xml:space="preserve">The reverse check (C) initially flagged 5/1 ("Relationship between Multiplication and Division") as served by the bank to Karnataka and Private but by the lookup only to Delhi. This was a stale-workbook artifact. The pre-correction workbook held Karnataka, Private, and Telangana copies of 5/1, including</w:t>
       </w:r>
       <w:r>
         <w:t xml:space="preserve"> </w:t>
@@ -2442,7 +2400,7 @@
     <w:tbl>
       <w:tblPr>
         <w:tblStyle w:val="Table"/>
-        <w:tblW w:type="pct" w:w="5000"/>
+        <w:tblW w:type="auto" w:w="0"/>
         <w:tblLook w:firstRow="1" w:lastRow="0" w:firstColumn="0" w:lastColumn="0" w:noHBand="0" w:noVBand="0" w:val="0020"/>
         <w:jc w:val="start"/>
       </w:tblPr>

</xml_diff>